<commit_message>
Week 2 reworked: place-value + questioning, new artifact model
- Tue Thinker-Doer: Squares on the Hundred Chart + Greatest Product
- Thu: debrief -> Hundred Chart Challenge fishbowl -> MQR; genAI photo homework
- PE#2 (MQR): 83-18 smaller-from-larger diagnosis, 5 questions -> pick 1 -> rationale, 20-pt rubric
- Reading Journal (Reinhart + Switzer), Hundred Chart cards
- Retire SR2 + QFT docx

Co-Authored-By: Claude Opus 4.8 (1M context) <noreply@anthropic.com>
</commit_message>
<xml_diff>
--- a/week-2-listening-questioning/week-2-mqr.docx
+++ b/week-2-listening-questioning/week-2-mqr.docx
@@ -13,7 +13,7 @@
           <w:b/>
           <w:color w:val="1F4E96"/>
         </w:rPr>
-        <w:t>Making Reasoning Visible — One Child, Two Ways</w:t>
+        <w:t>Pedagogical Excursion #2 — Diagnosing a Subtraction Error</w:t>
       </w:r>
     </w:p>
     <w:p>
@@ -35,7 +35,7 @@
           <w:color w:val="1F4E96"/>
           <w:sz w:val="26"/>
         </w:rPr>
-        <w:t>Week 2 · Listener → Questioner · Number &amp; Base-Ten</w:t>
+        <w:t>20 points possible</w:t>
       </w:r>
     </w:p>
     <w:p>
@@ -45,7 +45,7 @@
           <w:b w:val="0"/>
           <w:i/>
         </w:rPr>
-        <w:t>In class · with your partner · no AI.</w:t>
+        <w:t>In class · on your own or with a partner (no more than two). Collected at the end of class Thursday.</w:t>
       </w:r>
     </w:p>
     <w:p>
@@ -69,7 +69,7 @@
           <w:b w:val="0"/>
           <w:i w:val="0"/>
         </w:rPr>
-        <w:t>Find 1003 − 999.  Solve it more than one way, and show your thinking so someone else could follow it.</w:t>
+        <w:t>What number is 18 less than 83?  (That is, find 83 − 18.)  Show your thinking so someone else could follow it.</w:t>
       </w:r>
     </w:p>
     <w:p>
@@ -108,7 +108,7 @@
             <w:r>
               <w:drawing>
                 <wp:inline xmlns:a="http://schemas.openxmlformats.org/drawingml/2006/main" xmlns:pic="http://schemas.openxmlformats.org/drawingml/2006/picture">
-                  <wp:extent cx="6309360" cy="2898382"/>
+                  <wp:extent cx="4937760" cy="3104330"/>
                   <wp:docPr id="1" name="Picture 1"/>
                   <wp:cNvGraphicFramePr>
                     <a:graphicFrameLocks noChangeAspect="1"/>
@@ -129,7 +129,7 @@
                         <pic:spPr>
                           <a:xfrm>
                             <a:off x="0" y="0"/>
-                            <a:ext cx="6309360" cy="2898382"/>
+                            <a:ext cx="4937760" cy="3104330"/>
                           </a:xfrm>
                           <a:prstGeom prst="rect"/>
                         </pic:spPr>
@@ -138,16 +138,6 @@
                   </a:graphic>
                 </wp:inline>
               </w:drawing>
-            </w:r>
-          </w:p>
-          <w:p>
-            <w:r>
-              <w:rPr>
-                <w:rFonts w:ascii="Inter" w:hAnsi="Inter"/>
-                <w:b w:val="0"/>
-                <w:i/>
-              </w:rPr>
-              <w:t>The child solved the same problem two ways and got two different answers.</w:t>
             </w:r>
           </w:p>
         </w:tc>
@@ -225,7 +215,7 @@
         <w:rPr>
           <w:rFonts w:ascii="Inter" w:hAnsi="Inter"/>
         </w:rPr>
-        <w:t>Brainstorm 5 open, non-leading questions you might ask this student to help them build a stronger mathematical understanding of the task. For each question, provide a brief justification why it's a good question.</w:t>
+        <w:t>Write five open, non-leading questions you might ask this student to help them build a stronger understanding of the task.</w:t>
       </w:r>
     </w:p>
     <w:p/>
@@ -236,41 +226,14 @@
           <w:b/>
           <w:color w:val="1F4E96"/>
         </w:rPr>
-        <w:t xml:space="preserve">1)  </w:t>
-      </w:r>
-      <w:r>
-        <w:rPr>
-          <w:rFonts w:ascii="Inter" w:hAnsi="Inter"/>
-          <w:i/>
-          <w:color w:val="1F4E96"/>
-        </w:rPr>
-        <w:t xml:space="preserve">Question:  </w:t>
+        <w:t xml:space="preserve">1.  </w:t>
       </w:r>
       <w:r>
         <w:rPr>
           <w:rFonts w:ascii="Inter" w:hAnsi="Inter"/>
           <w:color w:val="BFBFBF"/>
         </w:rPr>
-        <w:t>________________________________________________________________</w:t>
-      </w:r>
-    </w:p>
-    <w:p>
-      <w:pPr>
-        <w:ind w:left="461"/>
-      </w:pPr>
-      <w:r>
-        <w:rPr>
-          <w:rFonts w:ascii="Inter" w:hAnsi="Inter"/>
-          <w:i/>
-        </w:rPr>
-        <w:t xml:space="preserve">Why it's a good question:  </w:t>
-      </w:r>
-      <w:r>
-        <w:rPr>
-          <w:rFonts w:ascii="Inter" w:hAnsi="Inter"/>
-          <w:color w:val="BFBFBF"/>
-        </w:rPr>
-        <w:t>________________________________________________</w:t>
+        <w:t>________________________________________________________________________________________</w:t>
       </w:r>
     </w:p>
     <w:p/>
@@ -281,41 +244,14 @@
           <w:b/>
           <w:color w:val="1F4E96"/>
         </w:rPr>
-        <w:t xml:space="preserve">2)  </w:t>
-      </w:r>
-      <w:r>
-        <w:rPr>
-          <w:rFonts w:ascii="Inter" w:hAnsi="Inter"/>
-          <w:i/>
-          <w:color w:val="1F4E96"/>
-        </w:rPr>
-        <w:t xml:space="preserve">Question:  </w:t>
+        <w:t xml:space="preserve">2.  </w:t>
       </w:r>
       <w:r>
         <w:rPr>
           <w:rFonts w:ascii="Inter" w:hAnsi="Inter"/>
           <w:color w:val="BFBFBF"/>
         </w:rPr>
-        <w:t>________________________________________________________________</w:t>
-      </w:r>
-    </w:p>
-    <w:p>
-      <w:pPr>
-        <w:ind w:left="461"/>
-      </w:pPr>
-      <w:r>
-        <w:rPr>
-          <w:rFonts w:ascii="Inter" w:hAnsi="Inter"/>
-          <w:i/>
-        </w:rPr>
-        <w:t xml:space="preserve">Why it's a good question:  </w:t>
-      </w:r>
-      <w:r>
-        <w:rPr>
-          <w:rFonts w:ascii="Inter" w:hAnsi="Inter"/>
-          <w:color w:val="BFBFBF"/>
-        </w:rPr>
-        <w:t>________________________________________________</w:t>
+        <w:t>________________________________________________________________________________________</w:t>
       </w:r>
     </w:p>
     <w:p/>
@@ -326,41 +262,14 @@
           <w:b/>
           <w:color w:val="1F4E96"/>
         </w:rPr>
-        <w:t xml:space="preserve">3)  </w:t>
-      </w:r>
-      <w:r>
-        <w:rPr>
-          <w:rFonts w:ascii="Inter" w:hAnsi="Inter"/>
-          <w:i/>
-          <w:color w:val="1F4E96"/>
-        </w:rPr>
-        <w:t xml:space="preserve">Question:  </w:t>
+        <w:t xml:space="preserve">3.  </w:t>
       </w:r>
       <w:r>
         <w:rPr>
           <w:rFonts w:ascii="Inter" w:hAnsi="Inter"/>
           <w:color w:val="BFBFBF"/>
         </w:rPr>
-        <w:t>________________________________________________________________</w:t>
-      </w:r>
-    </w:p>
-    <w:p>
-      <w:pPr>
-        <w:ind w:left="461"/>
-      </w:pPr>
-      <w:r>
-        <w:rPr>
-          <w:rFonts w:ascii="Inter" w:hAnsi="Inter"/>
-          <w:i/>
-        </w:rPr>
-        <w:t xml:space="preserve">Why it's a good question:  </w:t>
-      </w:r>
-      <w:r>
-        <w:rPr>
-          <w:rFonts w:ascii="Inter" w:hAnsi="Inter"/>
-          <w:color w:val="BFBFBF"/>
-        </w:rPr>
-        <w:t>________________________________________________</w:t>
+        <w:t>________________________________________________________________________________________</w:t>
       </w:r>
     </w:p>
     <w:p/>
@@ -371,41 +280,14 @@
           <w:b/>
           <w:color w:val="1F4E96"/>
         </w:rPr>
-        <w:t xml:space="preserve">4)  </w:t>
-      </w:r>
-      <w:r>
-        <w:rPr>
-          <w:rFonts w:ascii="Inter" w:hAnsi="Inter"/>
-          <w:i/>
-          <w:color w:val="1F4E96"/>
-        </w:rPr>
-        <w:t xml:space="preserve">Question:  </w:t>
+        <w:t xml:space="preserve">4.  </w:t>
       </w:r>
       <w:r>
         <w:rPr>
           <w:rFonts w:ascii="Inter" w:hAnsi="Inter"/>
           <w:color w:val="BFBFBF"/>
         </w:rPr>
-        <w:t>________________________________________________________________</w:t>
-      </w:r>
-    </w:p>
-    <w:p>
-      <w:pPr>
-        <w:ind w:left="461"/>
-      </w:pPr>
-      <w:r>
-        <w:rPr>
-          <w:rFonts w:ascii="Inter" w:hAnsi="Inter"/>
-          <w:i/>
-        </w:rPr>
-        <w:t xml:space="preserve">Why it's a good question:  </w:t>
-      </w:r>
-      <w:r>
-        <w:rPr>
-          <w:rFonts w:ascii="Inter" w:hAnsi="Inter"/>
-          <w:color w:val="BFBFBF"/>
-        </w:rPr>
-        <w:t>________________________________________________</w:t>
+        <w:t>________________________________________________________________________________________</w:t>
       </w:r>
     </w:p>
     <w:p/>
@@ -416,44 +298,298 @@
           <w:b/>
           <w:color w:val="1F4E96"/>
         </w:rPr>
-        <w:t xml:space="preserve">5)  </w:t>
-      </w:r>
-      <w:r>
-        <w:rPr>
-          <w:rFonts w:ascii="Inter" w:hAnsi="Inter"/>
-          <w:i/>
-          <w:color w:val="1F4E96"/>
-        </w:rPr>
-        <w:t xml:space="preserve">Question:  </w:t>
+        <w:t xml:space="preserve">5.  </w:t>
       </w:r>
       <w:r>
         <w:rPr>
           <w:rFonts w:ascii="Inter" w:hAnsi="Inter"/>
           <w:color w:val="BFBFBF"/>
         </w:rPr>
-        <w:t>________________________________________________________________</w:t>
+        <w:t>________________________________________________________________________________________</w:t>
       </w:r>
     </w:p>
+    <w:p/>
     <w:p>
-      <w:pPr>
-        <w:ind w:left="461"/>
-      </w:pPr>
       <w:r>
         <w:rPr>
           <w:rFonts w:ascii="Inter" w:hAnsi="Inter"/>
-          <w:i/>
+          <w:b/>
+          <w:color w:val="1F4E96"/>
         </w:rPr>
-        <w:t xml:space="preserve">Why it's a good question:  </w:t>
+        <w:t xml:space="preserve">3.  </w:t>
+      </w:r>
+      <w:r>
+        <w:rPr>
+          <w:rFonts w:ascii="Inter" w:hAnsi="Inter"/>
+        </w:rPr>
+        <w:t>Choose the one question above that best addresses this student's learning needs. Write it here, then explain why it fits THIS child and this misconception.</w:t>
+      </w:r>
+    </w:p>
+    <w:p/>
+    <w:p>
+      <w:r>
+        <w:rPr>
+          <w:rFonts w:ascii="Inter" w:hAnsi="Inter"/>
+          <w:b/>
+          <w:color w:val="1F4E96"/>
+        </w:rPr>
+        <w:t xml:space="preserve">Chosen question:  </w:t>
       </w:r>
       <w:r>
         <w:rPr>
           <w:rFonts w:ascii="Inter" w:hAnsi="Inter"/>
           <w:color w:val="BFBFBF"/>
         </w:rPr>
-        <w:t>________________________________________________</w:t>
+        <w:t>__________________________________________________________________________</w:t>
       </w:r>
     </w:p>
-    <w:p/>
+    <w:p>
+      <w:r>
+        <w:rPr>
+          <w:rFonts w:ascii="Inter" w:hAnsi="Inter"/>
+          <w:b/>
+          <w:i w:val="0"/>
+        </w:rPr>
+        <w:t>Why it fits this child (3–5 sentences):</w:t>
+      </w:r>
+    </w:p>
+    <w:p>
+      <w:r>
+        <w:rPr>
+          <w:rFonts w:ascii="Inter" w:hAnsi="Inter"/>
+          <w:color w:val="BFBFBF"/>
+        </w:rPr>
+        <w:t>____________________________________________________________________________________________</w:t>
+      </w:r>
+    </w:p>
+    <w:p>
+      <w:r>
+        <w:rPr>
+          <w:rFonts w:ascii="Inter" w:hAnsi="Inter"/>
+          <w:color w:val="BFBFBF"/>
+        </w:rPr>
+        <w:t>____________________________________________________________________________________________</w:t>
+      </w:r>
+    </w:p>
+    <w:p>
+      <w:r>
+        <w:rPr>
+          <w:rFonts w:ascii="Inter" w:hAnsi="Inter"/>
+          <w:color w:val="BFBFBF"/>
+        </w:rPr>
+        <w:t>____________________________________________________________________________________________</w:t>
+      </w:r>
+    </w:p>
+    <w:p>
+      <w:r>
+        <w:rPr>
+          <w:rFonts w:ascii="Inter" w:hAnsi="Inter"/>
+          <w:color w:val="BFBFBF"/>
+        </w:rPr>
+        <w:t>____________________________________________________________________________________________</w:t>
+      </w:r>
+    </w:p>
+    <w:p>
+      <w:r>
+        <w:rPr>
+          <w:rFonts w:ascii="Inter" w:hAnsi="Inter"/>
+          <w:color w:val="BFBFBF"/>
+        </w:rPr>
+        <w:t>____________________________________________________________________________________________</w:t>
+      </w:r>
+    </w:p>
+    <w:p>
+      <w:r>
+        <w:rPr>
+          <w:rFonts w:ascii="Inter" w:hAnsi="Inter"/>
+          <w:color w:val="BFBFBF"/>
+        </w:rPr>
+        <w:t>____________________________________________________________________________________________</w:t>
+      </w:r>
+    </w:p>
+    <w:p>
+      <w:r>
+        <w:rPr>
+          <w:rFonts w:ascii="Inter" w:hAnsi="Inter"/>
+          <w:color w:val="BFBFBF"/>
+        </w:rPr>
+        <w:t>____________________________________________________________________________________________</w:t>
+      </w:r>
+    </w:p>
+    <w:p>
+      <w:r>
+        <w:rPr>
+          <w:rFonts w:ascii="Inter" w:hAnsi="Inter"/>
+          <w:color w:val="BFBFBF"/>
+        </w:rPr>
+        <w:t>____________________________________________________________________________________________</w:t>
+      </w:r>
+    </w:p>
+    <w:p>
+      <w:r>
+        <w:br w:type="page"/>
+      </w:r>
+    </w:p>
+    <w:p>
+      <w:pPr>
+        <w:spacing w:after="120"/>
+      </w:pPr>
+      <w:r>
+        <w:rPr>
+          <w:rFonts w:ascii="Inter" w:hAnsi="Inter"/>
+          <w:b/>
+          <w:color w:val="1F4E96"/>
+          <w:sz w:val="24"/>
+        </w:rPr>
+        <w:t>How is my work assessed?</w:t>
+      </w:r>
+    </w:p>
+    <w:tbl>
+      <w:tblPr>
+        <w:tblStyle w:val="TableGrid"/>
+        <w:tblW w:type="auto" w:w="0"/>
+        <w:tblLook w:firstColumn="1" w:firstRow="1" w:lastColumn="0" w:lastRow="0" w:noHBand="0" w:noVBand="1" w:val="04A0"/>
+      </w:tblPr>
+      <w:tblGrid>
+        <w:gridCol w:w="5256"/>
+        <w:gridCol w:w="5256"/>
+      </w:tblGrid>
+      <w:tr>
+        <w:tc>
+          <w:tcPr>
+            <w:tcW w:type="dxa" w:w="3168"/>
+            <w:shd w:val="clear" w:fill="1F4E96"/>
+          </w:tcPr>
+          <w:p>
+            <w:r>
+              <w:rPr>
+                <w:rFonts w:ascii="Inter" w:hAnsi="Inter"/>
+                <w:b/>
+                <w:i w:val="0"/>
+                <w:color w:val="FFFFFF"/>
+              </w:rPr>
+              <w:t>Criteria</w:t>
+            </w:r>
+          </w:p>
+        </w:tc>
+        <w:tc>
+          <w:tcPr>
+            <w:tcW w:type="dxa" w:w="7200"/>
+            <w:shd w:val="clear" w:fill="1F4E96"/>
+          </w:tcPr>
+          <w:p>
+            <w:r>
+              <w:rPr>
+                <w:rFonts w:ascii="Inter" w:hAnsi="Inter"/>
+                <w:b/>
+                <w:i w:val="0"/>
+                <w:color w:val="FFFFFF"/>
+              </w:rPr>
+              <w:t>Expectations</w:t>
+            </w:r>
+          </w:p>
+        </w:tc>
+      </w:tr>
+      <w:tr>
+        <w:tc>
+          <w:tcPr>
+            <w:tcW w:type="dxa" w:w="3168"/>
+          </w:tcPr>
+          <w:p>
+            <w:r>
+              <w:rPr>
+                <w:rFonts w:ascii="Inter" w:hAnsi="Inter"/>
+                <w:b/>
+                <w:i w:val="0"/>
+                <w:color w:val="1F4E96"/>
+              </w:rPr>
+              <w:t>Diagnosis (5)</w:t>
+            </w:r>
+          </w:p>
+        </w:tc>
+        <w:tc>
+          <w:tcPr>
+            <w:tcW w:type="dxa" w:w="7200"/>
+          </w:tcPr>
+          <w:p>
+            <w:r>
+              <w:rPr>
+                <w:rFonts w:ascii="Inter" w:hAnsi="Inter"/>
+                <w:b w:val="0"/>
+                <w:i w:val="0"/>
+              </w:rPr>
+              <w:t>Names what the child understands and the misconception, at the place-value root — grounded in specific details from the work.</w:t>
+            </w:r>
+          </w:p>
+        </w:tc>
+      </w:tr>
+      <w:tr>
+        <w:tc>
+          <w:tcPr>
+            <w:tcW w:type="dxa" w:w="3168"/>
+          </w:tcPr>
+          <w:p>
+            <w:r>
+              <w:rPr>
+                <w:rFonts w:ascii="Inter" w:hAnsi="Inter"/>
+                <w:b/>
+                <w:i w:val="0"/>
+                <w:color w:val="1F4E96"/>
+              </w:rPr>
+              <w:t>Questions (5 — 1 pt each)</w:t>
+            </w:r>
+          </w:p>
+        </w:tc>
+        <w:tc>
+          <w:tcPr>
+            <w:tcW w:type="dxa" w:w="7200"/>
+          </w:tcPr>
+          <w:p>
+            <w:r>
+              <w:rPr>
+                <w:rFonts w:ascii="Inter" w:hAnsi="Inter"/>
+                <w:b w:val="0"/>
+                <w:i w:val="0"/>
+              </w:rPr>
+              <w:t>Five open, non-leading questions — not telling, hinting, or funneling the answer.</w:t>
+            </w:r>
+          </w:p>
+        </w:tc>
+      </w:tr>
+      <w:tr>
+        <w:tc>
+          <w:tcPr>
+            <w:tcW w:type="dxa" w:w="3168"/>
+          </w:tcPr>
+          <w:p>
+            <w:r>
+              <w:rPr>
+                <w:rFonts w:ascii="Inter" w:hAnsi="Inter"/>
+                <w:b/>
+                <w:i w:val="0"/>
+                <w:color w:val="1F4E96"/>
+              </w:rPr>
+              <w:t>Rationale for your chosen question (10)</w:t>
+            </w:r>
+          </w:p>
+        </w:tc>
+        <w:tc>
+          <w:tcPr>
+            <w:tcW w:type="dxa" w:w="7200"/>
+          </w:tcPr>
+          <w:p>
+            <w:r>
+              <w:rPr>
+                <w:rFonts w:ascii="Inter" w:hAnsi="Inter"/>
+                <w:b w:val="0"/>
+                <w:i w:val="0"/>
+              </w:rPr>
+              <w:t>Why this question fits THIS child and THIS misconception — specific to the context, not a general prompt. ("What are you thinking?" is too vague.)</w:t>
+            </w:r>
+          </w:p>
+        </w:tc>
+      </w:tr>
+    </w:tbl>
     <w:sectPr>
       <w:pgSz w:w="12240" w:h="15840"/>
       <w:pgMar w:top="864" w:right="864" w:bottom="864" w:left="864" w:header="720" w:footer="720" w:gutter="0"/>

</xml_diff>

<commit_message>
Wk2 PE#2: open writing space for the questions
Co-Authored-By: Claude Opus 4.8 (1M context) <noreply@anthropic.com>
</commit_message>
<xml_diff>
--- a/week-2-listening-questioning/week-2-mqr.docx
+++ b/week-2-listening-questioning/week-2-mqr.docx
@@ -219,95 +219,17 @@
       </w:r>
     </w:p>
     <w:p/>
-    <w:p>
-      <w:r>
-        <w:rPr>
-          <w:rFonts w:ascii="Inter" w:hAnsi="Inter"/>
-          <w:b/>
-          <w:color w:val="1F4E96"/>
-        </w:rPr>
-        <w:t xml:space="preserve">1.  </w:t>
-      </w:r>
-      <w:r>
-        <w:rPr>
-          <w:rFonts w:ascii="Inter" w:hAnsi="Inter"/>
-          <w:color w:val="BFBFBF"/>
-        </w:rPr>
-        <w:t>________________________________________________________________________________________</w:t>
-      </w:r>
-    </w:p>
     <w:p/>
-    <w:p>
-      <w:r>
-        <w:rPr>
-          <w:rFonts w:ascii="Inter" w:hAnsi="Inter"/>
-          <w:b/>
-          <w:color w:val="1F4E96"/>
-        </w:rPr>
-        <w:t xml:space="preserve">2.  </w:t>
-      </w:r>
-      <w:r>
-        <w:rPr>
-          <w:rFonts w:ascii="Inter" w:hAnsi="Inter"/>
-          <w:color w:val="BFBFBF"/>
-        </w:rPr>
-        <w:t>________________________________________________________________________________________</w:t>
-      </w:r>
-    </w:p>
     <w:p/>
-    <w:p>
-      <w:r>
-        <w:rPr>
-          <w:rFonts w:ascii="Inter" w:hAnsi="Inter"/>
-          <w:b/>
-          <w:color w:val="1F4E96"/>
-        </w:rPr>
-        <w:t xml:space="preserve">3.  </w:t>
-      </w:r>
-      <w:r>
-        <w:rPr>
-          <w:rFonts w:ascii="Inter" w:hAnsi="Inter"/>
-          <w:color w:val="BFBFBF"/>
-        </w:rPr>
-        <w:t>________________________________________________________________________________________</w:t>
-      </w:r>
-    </w:p>
     <w:p/>
-    <w:p>
-      <w:r>
-        <w:rPr>
-          <w:rFonts w:ascii="Inter" w:hAnsi="Inter"/>
-          <w:b/>
-          <w:color w:val="1F4E96"/>
-        </w:rPr>
-        <w:t xml:space="preserve">4.  </w:t>
-      </w:r>
-      <w:r>
-        <w:rPr>
-          <w:rFonts w:ascii="Inter" w:hAnsi="Inter"/>
-          <w:color w:val="BFBFBF"/>
-        </w:rPr>
-        <w:t>________________________________________________________________________________________</w:t>
-      </w:r>
-    </w:p>
     <w:p/>
-    <w:p>
-      <w:r>
-        <w:rPr>
-          <w:rFonts w:ascii="Inter" w:hAnsi="Inter"/>
-          <w:b/>
-          <w:color w:val="1F4E96"/>
-        </w:rPr>
-        <w:t xml:space="preserve">5.  </w:t>
-      </w:r>
-      <w:r>
-        <w:rPr>
-          <w:rFonts w:ascii="Inter" w:hAnsi="Inter"/>
-          <w:color w:val="BFBFBF"/>
-        </w:rPr>
-        <w:t>________________________________________________________________________________________</w:t>
-      </w:r>
-    </w:p>
+    <w:p/>
+    <w:p/>
+    <w:p/>
+    <w:p/>
+    <w:p/>
+    <w:p/>
+    <w:p/>
     <w:p/>
     <w:p>
       <w:r>

</xml_diff>

<commit_message>
Wk2 PE#2: consistent open space across all response areas
Co-Authored-By: Claude Opus 4.8 (1M context) <noreply@anthropic.com>
</commit_message>
<xml_diff>
--- a/week-2-listening-questioning/week-2-mqr.docx
+++ b/week-2-listening-questioning/week-2-mqr.docx
@@ -160,42 +160,12 @@
         <w:t>Diagnose this student solution. What does the student seem to understand (or not) about the mathematics of the task? Justify your response with details from the student's work.</w:t>
       </w:r>
     </w:p>
-    <w:p>
-      <w:r>
-        <w:rPr>
-          <w:rFonts w:ascii="Inter" w:hAnsi="Inter"/>
-          <w:color w:val="BFBFBF"/>
-        </w:rPr>
-        <w:t>____________________________________________________________________________________________</w:t>
-      </w:r>
-    </w:p>
-    <w:p>
-      <w:r>
-        <w:rPr>
-          <w:rFonts w:ascii="Inter" w:hAnsi="Inter"/>
-          <w:color w:val="BFBFBF"/>
-        </w:rPr>
-        <w:t>____________________________________________________________________________________________</w:t>
-      </w:r>
-    </w:p>
-    <w:p>
-      <w:r>
-        <w:rPr>
-          <w:rFonts w:ascii="Inter" w:hAnsi="Inter"/>
-          <w:color w:val="BFBFBF"/>
-        </w:rPr>
-        <w:t>____________________________________________________________________________________________</w:t>
-      </w:r>
-    </w:p>
-    <w:p>
-      <w:r>
-        <w:rPr>
-          <w:rFonts w:ascii="Inter" w:hAnsi="Inter"/>
-          <w:color w:val="BFBFBF"/>
-        </w:rPr>
-        <w:t>____________________________________________________________________________________________</w:t>
-      </w:r>
-    </w:p>
+    <w:p/>
+    <w:p/>
+    <w:p/>
+    <w:p/>
+    <w:p/>
+    <w:p/>
     <w:p/>
     <w:p>
       <w:r>
@@ -253,18 +223,13 @@
         <w:rPr>
           <w:rFonts w:ascii="Inter" w:hAnsi="Inter"/>
           <w:b/>
-          <w:color w:val="1F4E96"/>
+          <w:i w:val="0"/>
         </w:rPr>
-        <w:t xml:space="preserve">Chosen question:  </w:t>
-      </w:r>
-      <w:r>
-        <w:rPr>
-          <w:rFonts w:ascii="Inter" w:hAnsi="Inter"/>
-          <w:color w:val="BFBFBF"/>
-        </w:rPr>
-        <w:t>__________________________________________________________________________</w:t>
+        <w:t>Chosen question:</w:t>
       </w:r>
     </w:p>
+    <w:p/>
+    <w:p/>
     <w:p>
       <w:r>
         <w:rPr>
@@ -275,78 +240,16 @@
         <w:t>Why it fits this child (3–5 sentences):</w:t>
       </w:r>
     </w:p>
-    <w:p>
-      <w:r>
-        <w:rPr>
-          <w:rFonts w:ascii="Inter" w:hAnsi="Inter"/>
-          <w:color w:val="BFBFBF"/>
-        </w:rPr>
-        <w:t>____________________________________________________________________________________________</w:t>
-      </w:r>
-    </w:p>
-    <w:p>
-      <w:r>
-        <w:rPr>
-          <w:rFonts w:ascii="Inter" w:hAnsi="Inter"/>
-          <w:color w:val="BFBFBF"/>
-        </w:rPr>
-        <w:t>____________________________________________________________________________________________</w:t>
-      </w:r>
-    </w:p>
-    <w:p>
-      <w:r>
-        <w:rPr>
-          <w:rFonts w:ascii="Inter" w:hAnsi="Inter"/>
-          <w:color w:val="BFBFBF"/>
-        </w:rPr>
-        <w:t>____________________________________________________________________________________________</w:t>
-      </w:r>
-    </w:p>
-    <w:p>
-      <w:r>
-        <w:rPr>
-          <w:rFonts w:ascii="Inter" w:hAnsi="Inter"/>
-          <w:color w:val="BFBFBF"/>
-        </w:rPr>
-        <w:t>____________________________________________________________________________________________</w:t>
-      </w:r>
-    </w:p>
-    <w:p>
-      <w:r>
-        <w:rPr>
-          <w:rFonts w:ascii="Inter" w:hAnsi="Inter"/>
-          <w:color w:val="BFBFBF"/>
-        </w:rPr>
-        <w:t>____________________________________________________________________________________________</w:t>
-      </w:r>
-    </w:p>
-    <w:p>
-      <w:r>
-        <w:rPr>
-          <w:rFonts w:ascii="Inter" w:hAnsi="Inter"/>
-          <w:color w:val="BFBFBF"/>
-        </w:rPr>
-        <w:t>____________________________________________________________________________________________</w:t>
-      </w:r>
-    </w:p>
-    <w:p>
-      <w:r>
-        <w:rPr>
-          <w:rFonts w:ascii="Inter" w:hAnsi="Inter"/>
-          <w:color w:val="BFBFBF"/>
-        </w:rPr>
-        <w:t>____________________________________________________________________________________________</w:t>
-      </w:r>
-    </w:p>
-    <w:p>
-      <w:r>
-        <w:rPr>
-          <w:rFonts w:ascii="Inter" w:hAnsi="Inter"/>
-          <w:color w:val="BFBFBF"/>
-        </w:rPr>
-        <w:t>____________________________________________________________________________________________</w:t>
-      </w:r>
-    </w:p>
+    <w:p/>
+    <w:p/>
+    <w:p/>
+    <w:p/>
+    <w:p/>
+    <w:p/>
+    <w:p/>
+    <w:p/>
+    <w:p/>
+    <w:p/>
     <w:p>
       <w:r>
         <w:br w:type="page"/>

</xml_diff>